<commit_message>
feat: adicionar link do site no relatório técnico e ajustar estilos de entrada no CSS
</commit_message>
<xml_diff>
--- a/Relatorio Tecnico.docx
+++ b/Relatorio Tecnico.docx
@@ -94,16 +94,8 @@
               <w:rPr>
                 <w:b/>
               </w:rPr>
-              <w:t xml:space="preserve"> Miguel da Silva </w:t>
+              <w:t xml:space="preserve"> Miguel da Silva Virgínio</w:t>
             </w:r>
-            <w:proofErr w:type="spellStart"/>
-            <w:r>
-              <w:rPr>
-                <w:b/>
-              </w:rPr>
-              <w:t>Virgínio</w:t>
-            </w:r>
-            <w:proofErr w:type="spellEnd"/>
           </w:p>
         </w:tc>
         <w:tc>
@@ -589,16 +581,51 @@
           <w:szCs w:val="24"/>
         </w:rPr>
       </w:pPr>
-    </w:p>
-    <w:p>
-      <w:pPr>
-        <w:rPr>
-          <w:sz w:val="24"/>
-          <w:szCs w:val="24"/>
-        </w:rPr>
-      </w:pPr>
-      <w:bookmarkStart w:id="0" w:name="_gjdgxs" w:colFirst="0" w:colLast="0"/>
-      <w:bookmarkEnd w:id="0"/>
+      <w:r>
+        <w:rPr>
+          <w:sz w:val="24"/>
+          <w:szCs w:val="24"/>
+        </w:rPr>
+        <w:t xml:space="preserve">Site: </w:t>
+      </w:r>
+      <w:hyperlink r:id="rId8" w:history="1">
+        <w:r>
+          <w:rPr>
+            <w:rStyle w:val="Hyperlink"/>
+            <w:sz w:val="24"/>
+            <w:szCs w:val="24"/>
+          </w:rPr>
+          <w:t>https://miguelvirgini</w:t>
+        </w:r>
+        <w:bookmarkStart w:id="0" w:name="_GoBack"/>
+        <w:bookmarkEnd w:id="0"/>
+        <w:r>
+          <w:rPr>
+            <w:rStyle w:val="Hyperlink"/>
+            <w:sz w:val="24"/>
+            <w:szCs w:val="24"/>
+          </w:rPr>
+          <w:t>o</w:t>
+        </w:r>
+        <w:r>
+          <w:rPr>
+            <w:rStyle w:val="Hyperlink"/>
+            <w:sz w:val="24"/>
+            <w:szCs w:val="24"/>
+          </w:rPr>
+          <w:t>.netlify.app/</w:t>
+        </w:r>
+      </w:hyperlink>
+    </w:p>
+    <w:p>
+      <w:pPr>
+        <w:rPr>
+          <w:sz w:val="24"/>
+          <w:szCs w:val="24"/>
+        </w:rPr>
+      </w:pPr>
+      <w:bookmarkStart w:id="1" w:name="_gjdgxs" w:colFirst="0" w:colLast="0"/>
+      <w:bookmarkEnd w:id="1"/>
     </w:p>
     <w:p>
       <w:pPr>
@@ -672,12 +699,7 @@
         <w:pStyle w:val="Ttulo2"/>
       </w:pPr>
       <w:r>
-        <w:t>1. INTRO</w:t>
-      </w:r>
-      <w:bookmarkStart w:id="1" w:name="_GoBack"/>
-      <w:bookmarkEnd w:id="1"/>
-      <w:r>
-        <w:t>DUÇÃO</w:t>
+        <w:t>1. INTRODUÇÃO</w:t>
       </w:r>
     </w:p>
     <w:p>
@@ -3029,87 +3051,72 @@
           <w:color w:val="434343"/>
           <w:sz w:val="24"/>
           <w:szCs w:val="24"/>
-        </w:rPr>
-      </w:pPr>
-      <w:r>
-        <w:rPr>
-          <w:color w:val="434343"/>
-          <w:sz w:val="24"/>
-          <w:szCs w:val="24"/>
-        </w:rPr>
-        <w:t xml:space="preserve">  responsive.css</w:t>
-      </w:r>
-    </w:p>
-    <w:p>
-      <w:pPr>
-        <w:spacing w:line="360" w:lineRule="auto"/>
-        <w:rPr>
-          <w:color w:val="434343"/>
-          <w:sz w:val="24"/>
-          <w:szCs w:val="24"/>
-        </w:rPr>
-      </w:pPr>
-      <w:r>
-        <w:rPr>
-          <w:color w:val="434343"/>
-          <w:sz w:val="24"/>
-          <w:szCs w:val="24"/>
-        </w:rPr>
-        <w:t xml:space="preserve">    - Breakpoint </w:t>
-      </w:r>
-      <w:proofErr w:type="spellStart"/>
-      <w:r>
-        <w:rPr>
-          <w:color w:val="434343"/>
-          <w:sz w:val="24"/>
-          <w:szCs w:val="24"/>
-        </w:rPr>
-        <w:t>tablet</w:t>
-      </w:r>
-      <w:proofErr w:type="spellEnd"/>
-      <w:r>
-        <w:rPr>
-          <w:color w:val="434343"/>
-          <w:sz w:val="24"/>
-          <w:szCs w:val="24"/>
-        </w:rPr>
-        <w:t xml:space="preserve">: </w:t>
-      </w:r>
-      <w:proofErr w:type="spellStart"/>
-      <w:r>
-        <w:rPr>
-          <w:color w:val="434343"/>
-          <w:sz w:val="24"/>
-          <w:szCs w:val="24"/>
-        </w:rPr>
-        <w:t>max-width</w:t>
-      </w:r>
-      <w:proofErr w:type="spellEnd"/>
-      <w:r>
-        <w:rPr>
-          <w:color w:val="434343"/>
-          <w:sz w:val="24"/>
-          <w:szCs w:val="24"/>
-        </w:rPr>
-        <w:t xml:space="preserve"> 768px</w:t>
-      </w:r>
-    </w:p>
-    <w:p>
-      <w:pPr>
-        <w:spacing w:line="360" w:lineRule="auto"/>
-        <w:rPr>
-          <w:color w:val="434343"/>
-          <w:sz w:val="24"/>
-          <w:szCs w:val="24"/>
-        </w:rPr>
-      </w:pPr>
-      <w:r>
-        <w:rPr>
-          <w:color w:val="434343"/>
-          <w:sz w:val="24"/>
-          <w:szCs w:val="24"/>
-        </w:rPr>
-        <w:t xml:space="preserve">    - Breakpoint mobile: </w:t>
+          <w:lang w:val="en-US"/>
+        </w:rPr>
+      </w:pPr>
+      <w:r>
+        <w:rPr>
+          <w:color w:val="434343"/>
+          <w:sz w:val="24"/>
+          <w:szCs w:val="24"/>
+        </w:rPr>
+        <w:t xml:space="preserve">  </w:t>
+      </w:r>
+      <w:r>
+        <w:rPr>
+          <w:color w:val="434343"/>
+          <w:sz w:val="24"/>
+          <w:szCs w:val="24"/>
+          <w:lang w:val="en-US"/>
+        </w:rPr>
+        <w:t>responsive.css</w:t>
+      </w:r>
+    </w:p>
+    <w:p>
+      <w:pPr>
+        <w:spacing w:line="360" w:lineRule="auto"/>
+        <w:rPr>
+          <w:color w:val="434343"/>
+          <w:sz w:val="24"/>
+          <w:szCs w:val="24"/>
+          <w:lang w:val="en-US"/>
+        </w:rPr>
+      </w:pPr>
+      <w:r>
+        <w:rPr>
+          <w:color w:val="434343"/>
+          <w:sz w:val="24"/>
+          <w:szCs w:val="24"/>
+          <w:lang w:val="en-US"/>
+        </w:rPr>
+        <w:t xml:space="preserve">    - Breakpoint tablet: max-width 768px</w:t>
+      </w:r>
+    </w:p>
+    <w:p>
+      <w:pPr>
+        <w:spacing w:line="360" w:lineRule="auto"/>
+        <w:rPr>
+          <w:color w:val="434343"/>
+          <w:sz w:val="24"/>
+          <w:szCs w:val="24"/>
+        </w:rPr>
+      </w:pPr>
+      <w:r>
+        <w:rPr>
+          <w:color w:val="434343"/>
+          <w:sz w:val="24"/>
+          <w:szCs w:val="24"/>
+          <w:lang w:val="en-US"/>
+        </w:rPr>
+        <w:t xml:space="preserve">    </w:t>
+      </w:r>
+      <w:r>
+        <w:rPr>
+          <w:color w:val="434343"/>
+          <w:sz w:val="24"/>
+          <w:szCs w:val="24"/>
+        </w:rPr>
+        <w:t xml:space="preserve">- Breakpoint mobile: </w:t>
       </w:r>
       <w:proofErr w:type="spellStart"/>
       <w:r>
@@ -3539,12 +3546,6 @@
         <w:gridCol w:w="2772"/>
       </w:tblGrid>
       <w:tr>
-        <w:tblPrEx>
-          <w:tblCellMar>
-            <w:top w:w="0" w:type="dxa"/>
-            <w:bottom w:w="0" w:type="dxa"/>
-          </w:tblCellMar>
-        </w:tblPrEx>
         <w:tc>
           <w:tcPr>
             <w:tcW w:w="1434" w:type="dxa"/>
@@ -3622,12 +3623,6 @@
         </w:tc>
       </w:tr>
       <w:tr>
-        <w:tblPrEx>
-          <w:tblCellMar>
-            <w:top w:w="0" w:type="dxa"/>
-            <w:bottom w:w="0" w:type="dxa"/>
-          </w:tblCellMar>
-        </w:tblPrEx>
         <w:tc>
           <w:tcPr>
             <w:tcW w:w="1434" w:type="dxa"/>
@@ -3727,12 +3722,6 @@
         </w:tc>
       </w:tr>
       <w:tr>
-        <w:tblPrEx>
-          <w:tblCellMar>
-            <w:top w:w="0" w:type="dxa"/>
-            <w:bottom w:w="0" w:type="dxa"/>
-          </w:tblCellMar>
-        </w:tblPrEx>
         <w:tc>
           <w:tcPr>
             <w:tcW w:w="1434" w:type="dxa"/>
@@ -3840,12 +3829,6 @@
         </w:tc>
       </w:tr>
       <w:tr>
-        <w:tblPrEx>
-          <w:tblCellMar>
-            <w:top w:w="0" w:type="dxa"/>
-            <w:bottom w:w="0" w:type="dxa"/>
-          </w:tblCellMar>
-        </w:tblPrEx>
         <w:tc>
           <w:tcPr>
             <w:tcW w:w="1434" w:type="dxa"/>
@@ -4451,139 +4434,42 @@
           <w:color w:val="434343"/>
           <w:sz w:val="24"/>
           <w:szCs w:val="24"/>
-        </w:rPr>
-      </w:pPr>
-      <w:r>
-        <w:rPr>
-          <w:color w:val="434343"/>
-          <w:sz w:val="24"/>
-          <w:szCs w:val="24"/>
-        </w:rPr>
-        <w:t xml:space="preserve">  &lt;</w:t>
-      </w:r>
-      <w:proofErr w:type="gramStart"/>
-      <w:r>
-        <w:rPr>
-          <w:color w:val="434343"/>
-          <w:sz w:val="24"/>
-          <w:szCs w:val="24"/>
-        </w:rPr>
-        <w:t>meta</w:t>
-      </w:r>
-      <w:proofErr w:type="gramEnd"/>
-      <w:r>
-        <w:rPr>
-          <w:color w:val="434343"/>
-          <w:sz w:val="24"/>
-          <w:szCs w:val="24"/>
-        </w:rPr>
-        <w:t xml:space="preserve"> </w:t>
-      </w:r>
-      <w:proofErr w:type="spellStart"/>
-      <w:r>
-        <w:rPr>
-          <w:color w:val="434343"/>
-          <w:sz w:val="24"/>
-          <w:szCs w:val="24"/>
-        </w:rPr>
-        <w:t>name</w:t>
-      </w:r>
-      <w:proofErr w:type="spellEnd"/>
-      <w:r>
-        <w:rPr>
-          <w:color w:val="434343"/>
-          <w:sz w:val="24"/>
-          <w:szCs w:val="24"/>
-        </w:rPr>
-        <w:t>="</w:t>
-      </w:r>
-      <w:proofErr w:type="spellStart"/>
-      <w:r>
-        <w:rPr>
-          <w:color w:val="434343"/>
-          <w:sz w:val="24"/>
-          <w:szCs w:val="24"/>
-        </w:rPr>
-        <w:t>viewport</w:t>
-      </w:r>
-      <w:proofErr w:type="spellEnd"/>
-      <w:r>
-        <w:rPr>
-          <w:color w:val="434343"/>
-          <w:sz w:val="24"/>
-          <w:szCs w:val="24"/>
-        </w:rPr>
-        <w:t xml:space="preserve">" </w:t>
-      </w:r>
-      <w:proofErr w:type="spellStart"/>
-      <w:r>
-        <w:rPr>
-          <w:color w:val="434343"/>
-          <w:sz w:val="24"/>
-          <w:szCs w:val="24"/>
-        </w:rPr>
-        <w:t>content</w:t>
-      </w:r>
-      <w:proofErr w:type="spellEnd"/>
-      <w:r>
-        <w:rPr>
-          <w:color w:val="434343"/>
-          <w:sz w:val="24"/>
-          <w:szCs w:val="24"/>
-        </w:rPr>
-        <w:t>="</w:t>
-      </w:r>
-      <w:proofErr w:type="spellStart"/>
-      <w:r>
-        <w:rPr>
-          <w:color w:val="434343"/>
-          <w:sz w:val="24"/>
-          <w:szCs w:val="24"/>
-        </w:rPr>
-        <w:t>width</w:t>
-      </w:r>
-      <w:proofErr w:type="spellEnd"/>
-      <w:r>
-        <w:rPr>
-          <w:color w:val="434343"/>
-          <w:sz w:val="24"/>
-          <w:szCs w:val="24"/>
-        </w:rPr>
-        <w:t>=</w:t>
-      </w:r>
-      <w:proofErr w:type="spellStart"/>
-      <w:r>
-        <w:rPr>
-          <w:color w:val="434343"/>
-          <w:sz w:val="24"/>
-          <w:szCs w:val="24"/>
-        </w:rPr>
-        <w:t>device-width</w:t>
-      </w:r>
-      <w:proofErr w:type="spellEnd"/>
-      <w:r>
-        <w:rPr>
-          <w:color w:val="434343"/>
-          <w:sz w:val="24"/>
-          <w:szCs w:val="24"/>
-        </w:rPr>
-        <w:t>,</w:t>
-      </w:r>
-    </w:p>
-    <w:p>
-      <w:pPr>
-        <w:spacing w:line="360" w:lineRule="auto"/>
-        <w:rPr>
-          <w:color w:val="434343"/>
-          <w:sz w:val="24"/>
-          <w:szCs w:val="24"/>
-        </w:rPr>
-      </w:pPr>
-      <w:r>
-        <w:rPr>
-          <w:color w:val="434343"/>
-          <w:sz w:val="24"/>
-          <w:szCs w:val="24"/>
+          <w:lang w:val="en-US"/>
+        </w:rPr>
+      </w:pPr>
+      <w:r>
+        <w:rPr>
+          <w:color w:val="434343"/>
+          <w:sz w:val="24"/>
+          <w:szCs w:val="24"/>
+        </w:rPr>
+        <w:t xml:space="preserve">  </w:t>
+      </w:r>
+      <w:r>
+        <w:rPr>
+          <w:color w:val="434343"/>
+          <w:sz w:val="24"/>
+          <w:szCs w:val="24"/>
+          <w:lang w:val="en-US"/>
+        </w:rPr>
+        <w:t>&lt;meta name="viewport" content="width=device-width,</w:t>
+      </w:r>
+    </w:p>
+    <w:p>
+      <w:pPr>
+        <w:spacing w:line="360" w:lineRule="auto"/>
+        <w:rPr>
+          <w:color w:val="434343"/>
+          <w:sz w:val="24"/>
+          <w:szCs w:val="24"/>
+        </w:rPr>
+      </w:pPr>
+      <w:r>
+        <w:rPr>
+          <w:color w:val="434343"/>
+          <w:sz w:val="24"/>
+          <w:szCs w:val="24"/>
+          <w:lang w:val="en-US"/>
         </w:rPr>
         <w:t xml:space="preserve">    </w:t>
       </w:r>
@@ -5887,6 +5773,7 @@
         <w:rPr>
           <w:sz w:val="24"/>
           <w:szCs w:val="24"/>
+          <w:lang w:val="en-US"/>
         </w:rPr>
       </w:pPr>
       <w:r>
@@ -5896,854 +5783,23 @@
         </w:rPr>
         <w:t xml:space="preserve">  </w:t>
       </w:r>
-      <w:proofErr w:type="gramStart"/>
-      <w:r>
-        <w:rPr>
-          <w:sz w:val="24"/>
-          <w:szCs w:val="24"/>
+      <w:proofErr w:type="spellStart"/>
+      <w:r>
+        <w:rPr>
+          <w:sz w:val="24"/>
+          <w:szCs w:val="24"/>
+          <w:lang w:val="en-US"/>
         </w:rPr>
         <w:t>ao</w:t>
       </w:r>
-      <w:proofErr w:type="gramEnd"/>
-      <w:r>
-        <w:rPr>
-          <w:sz w:val="24"/>
-          <w:szCs w:val="24"/>
+      <w:proofErr w:type="spellEnd"/>
+      <w:r>
+        <w:rPr>
+          <w:sz w:val="24"/>
+          <w:szCs w:val="24"/>
+          <w:lang w:val="en-US"/>
         </w:rPr>
         <w:t xml:space="preserve"> topo com </w:t>
-      </w:r>
-      <w:proofErr w:type="spellStart"/>
-      <w:r>
-        <w:rPr>
-          <w:sz w:val="24"/>
-          <w:szCs w:val="24"/>
-        </w:rPr>
-        <w:t>window.scrollTo</w:t>
-      </w:r>
-      <w:proofErr w:type="spellEnd"/>
-      <w:r>
-        <w:rPr>
-          <w:sz w:val="24"/>
-          <w:szCs w:val="24"/>
-        </w:rPr>
-        <w:t xml:space="preserve">() e </w:t>
-      </w:r>
-      <w:proofErr w:type="spellStart"/>
-      <w:r>
-        <w:rPr>
-          <w:sz w:val="24"/>
-          <w:szCs w:val="24"/>
-        </w:rPr>
-        <w:t>behavior</w:t>
-      </w:r>
-      <w:proofErr w:type="spellEnd"/>
-      <w:r>
-        <w:rPr>
-          <w:sz w:val="24"/>
-          <w:szCs w:val="24"/>
-        </w:rPr>
-        <w:t xml:space="preserve">: </w:t>
-      </w:r>
-      <w:proofErr w:type="spellStart"/>
-      <w:r>
-        <w:rPr>
-          <w:sz w:val="24"/>
-          <w:szCs w:val="24"/>
-        </w:rPr>
-        <w:t>smooth</w:t>
-      </w:r>
-      <w:proofErr w:type="spellEnd"/>
-      <w:r>
-        <w:rPr>
-          <w:sz w:val="24"/>
-          <w:szCs w:val="24"/>
-        </w:rPr>
-        <w:t>.</w:t>
-      </w:r>
-    </w:p>
-    <w:p>
-      <w:pPr>
-        <w:spacing w:line="360" w:lineRule="auto"/>
-        <w:rPr>
-          <w:sz w:val="24"/>
-          <w:szCs w:val="24"/>
-        </w:rPr>
-      </w:pPr>
-    </w:p>
-    <w:p>
-      <w:pPr>
-        <w:spacing w:line="360" w:lineRule="auto"/>
-        <w:rPr>
-          <w:sz w:val="24"/>
-          <w:szCs w:val="24"/>
-        </w:rPr>
-      </w:pPr>
-      <w:r>
-        <w:rPr>
-          <w:sz w:val="24"/>
-          <w:szCs w:val="24"/>
-        </w:rPr>
-        <w:t xml:space="preserve">8.3 Scroll </w:t>
-      </w:r>
-      <w:proofErr w:type="spellStart"/>
-      <w:r>
-        <w:rPr>
-          <w:sz w:val="24"/>
-          <w:szCs w:val="24"/>
-        </w:rPr>
-        <w:t>Reveal</w:t>
-      </w:r>
-      <w:proofErr w:type="spellEnd"/>
-    </w:p>
-    <w:p>
-      <w:pPr>
-        <w:spacing w:line="360" w:lineRule="auto"/>
-        <w:rPr>
-          <w:sz w:val="24"/>
-          <w:szCs w:val="24"/>
-        </w:rPr>
-      </w:pPr>
-      <w:r>
-        <w:rPr>
-          <w:sz w:val="24"/>
-          <w:szCs w:val="24"/>
-        </w:rPr>
-        <w:t>──────────────────</w:t>
-      </w:r>
-    </w:p>
-    <w:p>
-      <w:pPr>
-        <w:spacing w:line="360" w:lineRule="auto"/>
-        <w:rPr>
-          <w:sz w:val="24"/>
-          <w:szCs w:val="24"/>
-        </w:rPr>
-      </w:pPr>
-      <w:r>
-        <w:rPr>
-          <w:sz w:val="24"/>
-          <w:szCs w:val="24"/>
-        </w:rPr>
-        <w:t xml:space="preserve">  Utiliza a </w:t>
-      </w:r>
-      <w:proofErr w:type="spellStart"/>
-      <w:r>
-        <w:rPr>
-          <w:sz w:val="24"/>
-          <w:szCs w:val="24"/>
-        </w:rPr>
-        <w:t>Intersection</w:t>
-      </w:r>
-      <w:proofErr w:type="spellEnd"/>
-      <w:r>
-        <w:rPr>
-          <w:sz w:val="24"/>
-          <w:szCs w:val="24"/>
-        </w:rPr>
-        <w:t xml:space="preserve"> </w:t>
-      </w:r>
-      <w:proofErr w:type="spellStart"/>
-      <w:r>
-        <w:rPr>
-          <w:sz w:val="24"/>
-          <w:szCs w:val="24"/>
-        </w:rPr>
-        <w:t>Observer</w:t>
-      </w:r>
-      <w:proofErr w:type="spellEnd"/>
-      <w:r>
-        <w:rPr>
-          <w:sz w:val="24"/>
-          <w:szCs w:val="24"/>
-        </w:rPr>
-        <w:t xml:space="preserve"> API para detectar</w:t>
-      </w:r>
-    </w:p>
-    <w:p>
-      <w:pPr>
-        <w:spacing w:line="360" w:lineRule="auto"/>
-        <w:rPr>
-          <w:sz w:val="24"/>
-          <w:szCs w:val="24"/>
-        </w:rPr>
-      </w:pPr>
-      <w:r>
-        <w:rPr>
-          <w:sz w:val="24"/>
-          <w:szCs w:val="24"/>
-        </w:rPr>
-        <w:t xml:space="preserve">  </w:t>
-      </w:r>
-      <w:proofErr w:type="gramStart"/>
-      <w:r>
-        <w:rPr>
-          <w:sz w:val="24"/>
-          <w:szCs w:val="24"/>
-        </w:rPr>
-        <w:t>quando</w:t>
-      </w:r>
-      <w:proofErr w:type="gramEnd"/>
-      <w:r>
-        <w:rPr>
-          <w:sz w:val="24"/>
-          <w:szCs w:val="24"/>
-        </w:rPr>
-        <w:t xml:space="preserve"> elementos entram na área visível da tela.</w:t>
-      </w:r>
-    </w:p>
-    <w:p>
-      <w:pPr>
-        <w:spacing w:line="360" w:lineRule="auto"/>
-        <w:rPr>
-          <w:sz w:val="24"/>
-          <w:szCs w:val="24"/>
-        </w:rPr>
-      </w:pPr>
-      <w:r>
-        <w:rPr>
-          <w:sz w:val="24"/>
-          <w:szCs w:val="24"/>
-        </w:rPr>
-        <w:t xml:space="preserve">  Ao entrar, recebem a classe CSS que ativa a</w:t>
-      </w:r>
-    </w:p>
-    <w:p>
-      <w:pPr>
-        <w:spacing w:line="360" w:lineRule="auto"/>
-        <w:rPr>
-          <w:sz w:val="24"/>
-          <w:szCs w:val="24"/>
-        </w:rPr>
-      </w:pPr>
-      <w:r>
-        <w:rPr>
-          <w:sz w:val="24"/>
-          <w:szCs w:val="24"/>
-        </w:rPr>
-        <w:t xml:space="preserve">  </w:t>
-      </w:r>
-      <w:proofErr w:type="gramStart"/>
-      <w:r>
-        <w:rPr>
-          <w:sz w:val="24"/>
-          <w:szCs w:val="24"/>
-        </w:rPr>
-        <w:t>transição</w:t>
-      </w:r>
-      <w:proofErr w:type="gramEnd"/>
-      <w:r>
-        <w:rPr>
-          <w:sz w:val="24"/>
-          <w:szCs w:val="24"/>
-        </w:rPr>
-        <w:t xml:space="preserve"> de opacidade e deslocamento (</w:t>
-      </w:r>
-      <w:proofErr w:type="spellStart"/>
-      <w:r>
-        <w:rPr>
-          <w:sz w:val="24"/>
-          <w:szCs w:val="24"/>
-        </w:rPr>
-        <w:t>fade-in</w:t>
-      </w:r>
-      <w:proofErr w:type="spellEnd"/>
-      <w:r>
-        <w:rPr>
-          <w:sz w:val="24"/>
-          <w:szCs w:val="24"/>
-        </w:rPr>
-        <w:t>).</w:t>
-      </w:r>
-    </w:p>
-    <w:p>
-      <w:pPr>
-        <w:spacing w:line="360" w:lineRule="auto"/>
-        <w:rPr>
-          <w:sz w:val="24"/>
-          <w:szCs w:val="24"/>
-        </w:rPr>
-      </w:pPr>
-    </w:p>
-    <w:p>
-      <w:pPr>
-        <w:spacing w:line="360" w:lineRule="auto"/>
-        <w:rPr>
-          <w:sz w:val="24"/>
-          <w:szCs w:val="24"/>
-        </w:rPr>
-      </w:pPr>
-      <w:r>
-        <w:rPr>
-          <w:sz w:val="24"/>
-          <w:szCs w:val="24"/>
-        </w:rPr>
-        <w:t>8.4 Barras de Habilidade Animadas</w:t>
-      </w:r>
-    </w:p>
-    <w:p>
-      <w:pPr>
-        <w:spacing w:line="360" w:lineRule="auto"/>
-        <w:rPr>
-          <w:sz w:val="24"/>
-          <w:szCs w:val="24"/>
-        </w:rPr>
-      </w:pPr>
-      <w:r>
-        <w:rPr>
-          <w:sz w:val="24"/>
-          <w:szCs w:val="24"/>
-        </w:rPr>
-        <w:t>───────────────────────────────────</w:t>
-      </w:r>
-    </w:p>
-    <w:p>
-      <w:pPr>
-        <w:spacing w:line="360" w:lineRule="auto"/>
-        <w:rPr>
-          <w:sz w:val="24"/>
-          <w:szCs w:val="24"/>
-        </w:rPr>
-      </w:pPr>
-      <w:r>
-        <w:rPr>
-          <w:sz w:val="24"/>
-          <w:szCs w:val="24"/>
-        </w:rPr>
-        <w:t xml:space="preserve">  As barras crescem de 0% até o valor definido no</w:t>
-      </w:r>
-    </w:p>
-    <w:p>
-      <w:pPr>
-        <w:spacing w:line="360" w:lineRule="auto"/>
-        <w:rPr>
-          <w:sz w:val="24"/>
-          <w:szCs w:val="24"/>
-        </w:rPr>
-      </w:pPr>
-      <w:r>
-        <w:rPr>
-          <w:sz w:val="24"/>
-          <w:szCs w:val="24"/>
-        </w:rPr>
-        <w:t xml:space="preserve">  CSS quando a seção de habilidades entra na tela.</w:t>
-      </w:r>
-    </w:p>
-    <w:p>
-      <w:pPr>
-        <w:spacing w:line="360" w:lineRule="auto"/>
-        <w:rPr>
-          <w:sz w:val="24"/>
-          <w:szCs w:val="24"/>
-        </w:rPr>
-      </w:pPr>
-      <w:r>
-        <w:rPr>
-          <w:sz w:val="24"/>
-          <w:szCs w:val="24"/>
-        </w:rPr>
-        <w:t xml:space="preserve">  O efeito usa </w:t>
-      </w:r>
-      <w:proofErr w:type="spellStart"/>
-      <w:r>
-        <w:rPr>
-          <w:sz w:val="24"/>
-          <w:szCs w:val="24"/>
-        </w:rPr>
-        <w:t>setTimeout</w:t>
-      </w:r>
-      <w:proofErr w:type="spellEnd"/>
-      <w:r>
-        <w:rPr>
-          <w:sz w:val="24"/>
-          <w:szCs w:val="24"/>
-        </w:rPr>
-        <w:t xml:space="preserve"> para sincronizar com a</w:t>
-      </w:r>
-    </w:p>
-    <w:p>
-      <w:pPr>
-        <w:spacing w:line="360" w:lineRule="auto"/>
-        <w:rPr>
-          <w:sz w:val="24"/>
-          <w:szCs w:val="24"/>
-        </w:rPr>
-      </w:pPr>
-      <w:r>
-        <w:rPr>
-          <w:sz w:val="24"/>
-          <w:szCs w:val="24"/>
-        </w:rPr>
-        <w:t xml:space="preserve">  </w:t>
-      </w:r>
-      <w:proofErr w:type="gramStart"/>
-      <w:r>
-        <w:rPr>
-          <w:sz w:val="24"/>
-          <w:szCs w:val="24"/>
-        </w:rPr>
-        <w:t>transição</w:t>
-      </w:r>
-      <w:proofErr w:type="gramEnd"/>
-      <w:r>
-        <w:rPr>
-          <w:sz w:val="24"/>
-          <w:szCs w:val="24"/>
-        </w:rPr>
-        <w:t xml:space="preserve"> CSS.</w:t>
-      </w:r>
-    </w:p>
-    <w:p>
-      <w:pPr>
-        <w:spacing w:line="360" w:lineRule="auto"/>
-        <w:rPr>
-          <w:sz w:val="24"/>
-          <w:szCs w:val="24"/>
-        </w:rPr>
-      </w:pPr>
-    </w:p>
-    <w:p>
-      <w:pPr>
-        <w:spacing w:line="360" w:lineRule="auto"/>
-        <w:rPr>
-          <w:sz w:val="24"/>
-          <w:szCs w:val="24"/>
-        </w:rPr>
-      </w:pPr>
-      <w:r>
-        <w:rPr>
-          <w:sz w:val="24"/>
-          <w:szCs w:val="24"/>
-        </w:rPr>
-        <w:t>8.5 Validação do Formulário</w:t>
-      </w:r>
-    </w:p>
-    <w:p>
-      <w:pPr>
-        <w:spacing w:line="360" w:lineRule="auto"/>
-        <w:rPr>
-          <w:sz w:val="24"/>
-          <w:szCs w:val="24"/>
-        </w:rPr>
-      </w:pPr>
-      <w:r>
-        <w:rPr>
-          <w:sz w:val="24"/>
-          <w:szCs w:val="24"/>
-        </w:rPr>
-        <w:t>────────────────────────────</w:t>
-      </w:r>
-    </w:p>
-    <w:p>
-      <w:pPr>
-        <w:spacing w:line="360" w:lineRule="auto"/>
-        <w:rPr>
-          <w:sz w:val="24"/>
-          <w:szCs w:val="24"/>
-        </w:rPr>
-      </w:pPr>
-      <w:r>
-        <w:rPr>
-          <w:sz w:val="24"/>
-          <w:szCs w:val="24"/>
-        </w:rPr>
-        <w:t xml:space="preserve">  Validações implementadas:</w:t>
-      </w:r>
-    </w:p>
-    <w:p>
-      <w:pPr>
-        <w:spacing w:line="360" w:lineRule="auto"/>
-        <w:rPr>
-          <w:sz w:val="24"/>
-          <w:szCs w:val="24"/>
-        </w:rPr>
-      </w:pPr>
-    </w:p>
-    <w:p>
-      <w:pPr>
-        <w:spacing w:line="360" w:lineRule="auto"/>
-        <w:rPr>
-          <w:sz w:val="24"/>
-          <w:szCs w:val="24"/>
-        </w:rPr>
-      </w:pPr>
-      <w:r>
-        <w:rPr>
-          <w:sz w:val="24"/>
-          <w:szCs w:val="24"/>
-        </w:rPr>
-        <w:t xml:space="preserve">  Campo Nome:</w:t>
-      </w:r>
-    </w:p>
-    <w:p>
-      <w:pPr>
-        <w:spacing w:line="360" w:lineRule="auto"/>
-        <w:rPr>
-          <w:sz w:val="24"/>
-          <w:szCs w:val="24"/>
-        </w:rPr>
-      </w:pPr>
-      <w:r>
-        <w:rPr>
-          <w:sz w:val="24"/>
-          <w:szCs w:val="24"/>
-        </w:rPr>
-        <w:t xml:space="preserve">    - Obrigatório</w:t>
-      </w:r>
-    </w:p>
-    <w:p>
-      <w:pPr>
-        <w:spacing w:line="360" w:lineRule="auto"/>
-        <w:rPr>
-          <w:sz w:val="24"/>
-          <w:szCs w:val="24"/>
-        </w:rPr>
-      </w:pPr>
-      <w:r>
-        <w:rPr>
-          <w:sz w:val="24"/>
-          <w:szCs w:val="24"/>
-        </w:rPr>
-        <w:t xml:space="preserve">    - Mínimo de 3 caracteres</w:t>
-      </w:r>
-    </w:p>
-    <w:p>
-      <w:pPr>
-        <w:spacing w:line="360" w:lineRule="auto"/>
-        <w:rPr>
-          <w:sz w:val="24"/>
-          <w:szCs w:val="24"/>
-        </w:rPr>
-      </w:pPr>
-    </w:p>
-    <w:p>
-      <w:pPr>
-        <w:spacing w:line="360" w:lineRule="auto"/>
-        <w:rPr>
-          <w:sz w:val="24"/>
-          <w:szCs w:val="24"/>
-        </w:rPr>
-      </w:pPr>
-      <w:r>
-        <w:rPr>
-          <w:sz w:val="24"/>
-          <w:szCs w:val="24"/>
-        </w:rPr>
-        <w:t xml:space="preserve">  Campo </w:t>
-      </w:r>
-      <w:proofErr w:type="spellStart"/>
-      <w:r>
-        <w:rPr>
-          <w:sz w:val="24"/>
-          <w:szCs w:val="24"/>
-        </w:rPr>
-        <w:t>Email</w:t>
-      </w:r>
-      <w:proofErr w:type="spellEnd"/>
-      <w:r>
-        <w:rPr>
-          <w:sz w:val="24"/>
-          <w:szCs w:val="24"/>
-        </w:rPr>
-        <w:t>:</w:t>
-      </w:r>
-    </w:p>
-    <w:p>
-      <w:pPr>
-        <w:spacing w:line="360" w:lineRule="auto"/>
-        <w:rPr>
-          <w:sz w:val="24"/>
-          <w:szCs w:val="24"/>
-        </w:rPr>
-      </w:pPr>
-      <w:r>
-        <w:rPr>
-          <w:sz w:val="24"/>
-          <w:szCs w:val="24"/>
-        </w:rPr>
-        <w:t xml:space="preserve">    - Obrigatório</w:t>
-      </w:r>
-    </w:p>
-    <w:p>
-      <w:pPr>
-        <w:spacing w:line="360" w:lineRule="auto"/>
-        <w:rPr>
-          <w:sz w:val="24"/>
-          <w:szCs w:val="24"/>
-        </w:rPr>
-      </w:pPr>
-      <w:r>
-        <w:rPr>
-          <w:sz w:val="24"/>
-          <w:szCs w:val="24"/>
-        </w:rPr>
-        <w:t xml:space="preserve">    - Formato validado com expressão regular:</w:t>
-      </w:r>
-    </w:p>
-    <w:p>
-      <w:pPr>
-        <w:spacing w:line="360" w:lineRule="auto"/>
-        <w:rPr>
-          <w:sz w:val="24"/>
-          <w:szCs w:val="24"/>
-        </w:rPr>
-      </w:pPr>
-      <w:r>
-        <w:rPr>
-          <w:sz w:val="24"/>
-          <w:szCs w:val="24"/>
-        </w:rPr>
-        <w:t xml:space="preserve">      /^[^\s@]+@[^\s@]+</w:t>
-      </w:r>
-      <w:proofErr w:type="gramStart"/>
-      <w:r>
-        <w:rPr>
-          <w:sz w:val="24"/>
-          <w:szCs w:val="24"/>
-        </w:rPr>
-        <w:t>\.[</w:t>
-      </w:r>
-      <w:proofErr w:type="gramEnd"/>
-      <w:r>
-        <w:rPr>
-          <w:sz w:val="24"/>
-          <w:szCs w:val="24"/>
-        </w:rPr>
-        <w:t>^\s@]+$/</w:t>
-      </w:r>
-    </w:p>
-    <w:p>
-      <w:pPr>
-        <w:spacing w:line="360" w:lineRule="auto"/>
-        <w:rPr>
-          <w:sz w:val="24"/>
-          <w:szCs w:val="24"/>
-        </w:rPr>
-      </w:pPr>
-    </w:p>
-    <w:p>
-      <w:pPr>
-        <w:spacing w:line="360" w:lineRule="auto"/>
-        <w:rPr>
-          <w:sz w:val="24"/>
-          <w:szCs w:val="24"/>
-        </w:rPr>
-      </w:pPr>
-      <w:r>
-        <w:rPr>
-          <w:sz w:val="24"/>
-          <w:szCs w:val="24"/>
-        </w:rPr>
-        <w:t xml:space="preserve">  Campo Mensagem:</w:t>
-      </w:r>
-    </w:p>
-    <w:p>
-      <w:pPr>
-        <w:spacing w:line="360" w:lineRule="auto"/>
-        <w:rPr>
-          <w:sz w:val="24"/>
-          <w:szCs w:val="24"/>
-        </w:rPr>
-      </w:pPr>
-      <w:r>
-        <w:rPr>
-          <w:sz w:val="24"/>
-          <w:szCs w:val="24"/>
-        </w:rPr>
-        <w:t xml:space="preserve">    - Obrigatório</w:t>
-      </w:r>
-    </w:p>
-    <w:p>
-      <w:pPr>
-        <w:spacing w:line="360" w:lineRule="auto"/>
-        <w:rPr>
-          <w:sz w:val="24"/>
-          <w:szCs w:val="24"/>
-        </w:rPr>
-      </w:pPr>
-      <w:r>
-        <w:rPr>
-          <w:sz w:val="24"/>
-          <w:szCs w:val="24"/>
-        </w:rPr>
-        <w:t xml:space="preserve">    - Mínimo de 10 caracteres</w:t>
-      </w:r>
-    </w:p>
-    <w:p>
-      <w:pPr>
-        <w:spacing w:line="360" w:lineRule="auto"/>
-        <w:rPr>
-          <w:sz w:val="24"/>
-          <w:szCs w:val="24"/>
-        </w:rPr>
-      </w:pPr>
-    </w:p>
-    <w:p>
-      <w:pPr>
-        <w:spacing w:line="360" w:lineRule="auto"/>
-        <w:rPr>
-          <w:sz w:val="24"/>
-          <w:szCs w:val="24"/>
-        </w:rPr>
-      </w:pPr>
-      <w:r>
-        <w:rPr>
-          <w:sz w:val="24"/>
-          <w:szCs w:val="24"/>
-        </w:rPr>
-        <w:t xml:space="preserve">  Comportamentos:</w:t>
-      </w:r>
-    </w:p>
-    <w:p>
-      <w:pPr>
-        <w:spacing w:line="360" w:lineRule="auto"/>
-        <w:rPr>
-          <w:sz w:val="24"/>
-          <w:szCs w:val="24"/>
-        </w:rPr>
-      </w:pPr>
-      <w:r>
-        <w:rPr>
-          <w:sz w:val="24"/>
-          <w:szCs w:val="24"/>
-        </w:rPr>
-        <w:t xml:space="preserve">    - Erros exibidos abaixo de cada campo</w:t>
-      </w:r>
-    </w:p>
-    <w:p>
-      <w:pPr>
-        <w:spacing w:line="360" w:lineRule="auto"/>
-        <w:rPr>
-          <w:sz w:val="24"/>
-          <w:szCs w:val="24"/>
-        </w:rPr>
-      </w:pPr>
-      <w:r>
-        <w:rPr>
-          <w:sz w:val="24"/>
-          <w:szCs w:val="24"/>
-        </w:rPr>
-        <w:t xml:space="preserve">    - Validação em tempo real ao sair do campo (</w:t>
-      </w:r>
-      <w:proofErr w:type="spellStart"/>
-      <w:r>
-        <w:rPr>
-          <w:sz w:val="24"/>
-          <w:szCs w:val="24"/>
-        </w:rPr>
-        <w:t>blur</w:t>
-      </w:r>
-      <w:proofErr w:type="spellEnd"/>
-      <w:r>
-        <w:rPr>
-          <w:sz w:val="24"/>
-          <w:szCs w:val="24"/>
-        </w:rPr>
-        <w:t>)</w:t>
-      </w:r>
-    </w:p>
-    <w:p>
-      <w:pPr>
-        <w:spacing w:line="360" w:lineRule="auto"/>
-        <w:rPr>
-          <w:sz w:val="24"/>
-          <w:szCs w:val="24"/>
-        </w:rPr>
-      </w:pPr>
-      <w:r>
-        <w:rPr>
-          <w:sz w:val="24"/>
-          <w:szCs w:val="24"/>
-        </w:rPr>
-        <w:t xml:space="preserve">    - Mensagem de sucesso exibida por 4 segundos</w:t>
-      </w:r>
-    </w:p>
-    <w:p>
-      <w:pPr>
-        <w:spacing w:line="360" w:lineRule="auto"/>
-        <w:rPr>
-          <w:sz w:val="24"/>
-          <w:szCs w:val="24"/>
-        </w:rPr>
-      </w:pPr>
-      <w:r>
-        <w:rPr>
-          <w:sz w:val="24"/>
-          <w:szCs w:val="24"/>
-        </w:rPr>
-        <w:t xml:space="preserve">    - Formulário limpo após envio bem-sucedido</w:t>
-      </w:r>
-    </w:p>
-    <w:p>
-      <w:pPr>
-        <w:spacing w:line="360" w:lineRule="auto"/>
-        <w:rPr>
-          <w:sz w:val="24"/>
-          <w:szCs w:val="24"/>
-        </w:rPr>
-      </w:pPr>
-    </w:p>
-    <w:p>
-      <w:pPr>
-        <w:spacing w:line="360" w:lineRule="auto"/>
-        <w:rPr>
-          <w:sz w:val="24"/>
-          <w:szCs w:val="24"/>
-        </w:rPr>
-      </w:pPr>
-      <w:r>
-        <w:rPr>
-          <w:sz w:val="24"/>
-          <w:szCs w:val="24"/>
-        </w:rPr>
-        <w:t>8.6 Link Ativo no Menu</w:t>
-      </w:r>
-    </w:p>
-    <w:p>
-      <w:pPr>
-        <w:spacing w:line="360" w:lineRule="auto"/>
-        <w:rPr>
-          <w:sz w:val="24"/>
-          <w:szCs w:val="24"/>
-        </w:rPr>
-      </w:pPr>
-      <w:r>
-        <w:rPr>
-          <w:sz w:val="24"/>
-          <w:szCs w:val="24"/>
-        </w:rPr>
-        <w:t>───────────────────────</w:t>
-      </w:r>
-    </w:p>
-    <w:p>
-      <w:pPr>
-        <w:spacing w:line="360" w:lineRule="auto"/>
-        <w:rPr>
-          <w:sz w:val="24"/>
-          <w:szCs w:val="24"/>
-        </w:rPr>
-      </w:pPr>
-      <w:r>
-        <w:rPr>
-          <w:sz w:val="24"/>
-          <w:szCs w:val="24"/>
-        </w:rPr>
-        <w:t xml:space="preserve">  Detecta automaticamente a página atual via</w:t>
-      </w:r>
-    </w:p>
-    <w:p>
-      <w:pPr>
-        <w:spacing w:line="360" w:lineRule="auto"/>
-        <w:rPr>
-          <w:sz w:val="24"/>
-          <w:szCs w:val="24"/>
-        </w:rPr>
-      </w:pPr>
-      <w:r>
-        <w:rPr>
-          <w:sz w:val="24"/>
-          <w:szCs w:val="24"/>
-        </w:rPr>
-        <w:t xml:space="preserve">  </w:t>
       </w:r>
       <w:proofErr w:type="spellStart"/>
       <w:proofErr w:type="gramStart"/>
@@ -6751,6 +5807,805 @@
         <w:rPr>
           <w:sz w:val="24"/>
           <w:szCs w:val="24"/>
+          <w:lang w:val="en-US"/>
+        </w:rPr>
+        <w:t>window.scrollTo</w:t>
+      </w:r>
+      <w:proofErr w:type="spellEnd"/>
+      <w:proofErr w:type="gramEnd"/>
+      <w:r>
+        <w:rPr>
+          <w:sz w:val="24"/>
+          <w:szCs w:val="24"/>
+          <w:lang w:val="en-US"/>
+        </w:rPr>
+        <w:t>() e behavior: smooth.</w:t>
+      </w:r>
+    </w:p>
+    <w:p>
+      <w:pPr>
+        <w:spacing w:line="360" w:lineRule="auto"/>
+        <w:rPr>
+          <w:sz w:val="24"/>
+          <w:szCs w:val="24"/>
+          <w:lang w:val="en-US"/>
+        </w:rPr>
+      </w:pPr>
+    </w:p>
+    <w:p>
+      <w:pPr>
+        <w:spacing w:line="360" w:lineRule="auto"/>
+        <w:rPr>
+          <w:sz w:val="24"/>
+          <w:szCs w:val="24"/>
+          <w:lang w:val="en-US"/>
+        </w:rPr>
+      </w:pPr>
+      <w:r>
+        <w:rPr>
+          <w:sz w:val="24"/>
+          <w:szCs w:val="24"/>
+          <w:lang w:val="en-US"/>
+        </w:rPr>
+        <w:t>8.3 Scroll Reveal</w:t>
+      </w:r>
+    </w:p>
+    <w:p>
+      <w:pPr>
+        <w:spacing w:line="360" w:lineRule="auto"/>
+        <w:rPr>
+          <w:sz w:val="24"/>
+          <w:szCs w:val="24"/>
+        </w:rPr>
+      </w:pPr>
+      <w:r>
+        <w:rPr>
+          <w:sz w:val="24"/>
+          <w:szCs w:val="24"/>
+        </w:rPr>
+        <w:t>──────────────────</w:t>
+      </w:r>
+    </w:p>
+    <w:p>
+      <w:pPr>
+        <w:spacing w:line="360" w:lineRule="auto"/>
+        <w:rPr>
+          <w:sz w:val="24"/>
+          <w:szCs w:val="24"/>
+        </w:rPr>
+      </w:pPr>
+      <w:r>
+        <w:rPr>
+          <w:sz w:val="24"/>
+          <w:szCs w:val="24"/>
+        </w:rPr>
+        <w:t xml:space="preserve">  Utiliza a </w:t>
+      </w:r>
+      <w:proofErr w:type="spellStart"/>
+      <w:r>
+        <w:rPr>
+          <w:sz w:val="24"/>
+          <w:szCs w:val="24"/>
+        </w:rPr>
+        <w:t>Intersection</w:t>
+      </w:r>
+      <w:proofErr w:type="spellEnd"/>
+      <w:r>
+        <w:rPr>
+          <w:sz w:val="24"/>
+          <w:szCs w:val="24"/>
+        </w:rPr>
+        <w:t xml:space="preserve"> </w:t>
+      </w:r>
+      <w:proofErr w:type="spellStart"/>
+      <w:r>
+        <w:rPr>
+          <w:sz w:val="24"/>
+          <w:szCs w:val="24"/>
+        </w:rPr>
+        <w:t>Observer</w:t>
+      </w:r>
+      <w:proofErr w:type="spellEnd"/>
+      <w:r>
+        <w:rPr>
+          <w:sz w:val="24"/>
+          <w:szCs w:val="24"/>
+        </w:rPr>
+        <w:t xml:space="preserve"> API para detectar</w:t>
+      </w:r>
+    </w:p>
+    <w:p>
+      <w:pPr>
+        <w:spacing w:line="360" w:lineRule="auto"/>
+        <w:rPr>
+          <w:sz w:val="24"/>
+          <w:szCs w:val="24"/>
+        </w:rPr>
+      </w:pPr>
+      <w:r>
+        <w:rPr>
+          <w:sz w:val="24"/>
+          <w:szCs w:val="24"/>
+        </w:rPr>
+        <w:t xml:space="preserve">  </w:t>
+      </w:r>
+      <w:proofErr w:type="gramStart"/>
+      <w:r>
+        <w:rPr>
+          <w:sz w:val="24"/>
+          <w:szCs w:val="24"/>
+        </w:rPr>
+        <w:t>quando</w:t>
+      </w:r>
+      <w:proofErr w:type="gramEnd"/>
+      <w:r>
+        <w:rPr>
+          <w:sz w:val="24"/>
+          <w:szCs w:val="24"/>
+        </w:rPr>
+        <w:t xml:space="preserve"> elementos entram na área visível da tela.</w:t>
+      </w:r>
+    </w:p>
+    <w:p>
+      <w:pPr>
+        <w:spacing w:line="360" w:lineRule="auto"/>
+        <w:rPr>
+          <w:sz w:val="24"/>
+          <w:szCs w:val="24"/>
+        </w:rPr>
+      </w:pPr>
+      <w:r>
+        <w:rPr>
+          <w:sz w:val="24"/>
+          <w:szCs w:val="24"/>
+        </w:rPr>
+        <w:t xml:space="preserve">  Ao entrar, recebem a classe CSS que ativa a</w:t>
+      </w:r>
+    </w:p>
+    <w:p>
+      <w:pPr>
+        <w:spacing w:line="360" w:lineRule="auto"/>
+        <w:rPr>
+          <w:sz w:val="24"/>
+          <w:szCs w:val="24"/>
+        </w:rPr>
+      </w:pPr>
+      <w:r>
+        <w:rPr>
+          <w:sz w:val="24"/>
+          <w:szCs w:val="24"/>
+        </w:rPr>
+        <w:t xml:space="preserve">  </w:t>
+      </w:r>
+      <w:proofErr w:type="gramStart"/>
+      <w:r>
+        <w:rPr>
+          <w:sz w:val="24"/>
+          <w:szCs w:val="24"/>
+        </w:rPr>
+        <w:t>transição</w:t>
+      </w:r>
+      <w:proofErr w:type="gramEnd"/>
+      <w:r>
+        <w:rPr>
+          <w:sz w:val="24"/>
+          <w:szCs w:val="24"/>
+        </w:rPr>
+        <w:t xml:space="preserve"> de opacidade e deslocamento (</w:t>
+      </w:r>
+      <w:proofErr w:type="spellStart"/>
+      <w:r>
+        <w:rPr>
+          <w:sz w:val="24"/>
+          <w:szCs w:val="24"/>
+        </w:rPr>
+        <w:t>fade-in</w:t>
+      </w:r>
+      <w:proofErr w:type="spellEnd"/>
+      <w:r>
+        <w:rPr>
+          <w:sz w:val="24"/>
+          <w:szCs w:val="24"/>
+        </w:rPr>
+        <w:t>).</w:t>
+      </w:r>
+    </w:p>
+    <w:p>
+      <w:pPr>
+        <w:spacing w:line="360" w:lineRule="auto"/>
+        <w:rPr>
+          <w:sz w:val="24"/>
+          <w:szCs w:val="24"/>
+        </w:rPr>
+      </w:pPr>
+    </w:p>
+    <w:p>
+      <w:pPr>
+        <w:spacing w:line="360" w:lineRule="auto"/>
+        <w:rPr>
+          <w:sz w:val="24"/>
+          <w:szCs w:val="24"/>
+        </w:rPr>
+      </w:pPr>
+      <w:r>
+        <w:rPr>
+          <w:sz w:val="24"/>
+          <w:szCs w:val="24"/>
+        </w:rPr>
+        <w:t>8.4 Barras de Habilidade Animadas</w:t>
+      </w:r>
+    </w:p>
+    <w:p>
+      <w:pPr>
+        <w:spacing w:line="360" w:lineRule="auto"/>
+        <w:rPr>
+          <w:sz w:val="24"/>
+          <w:szCs w:val="24"/>
+        </w:rPr>
+      </w:pPr>
+      <w:r>
+        <w:rPr>
+          <w:sz w:val="24"/>
+          <w:szCs w:val="24"/>
+        </w:rPr>
+        <w:t>───────────────────────────────────</w:t>
+      </w:r>
+    </w:p>
+    <w:p>
+      <w:pPr>
+        <w:spacing w:line="360" w:lineRule="auto"/>
+        <w:rPr>
+          <w:sz w:val="24"/>
+          <w:szCs w:val="24"/>
+        </w:rPr>
+      </w:pPr>
+      <w:r>
+        <w:rPr>
+          <w:sz w:val="24"/>
+          <w:szCs w:val="24"/>
+        </w:rPr>
+        <w:t xml:space="preserve">  As barras crescem de 0% até o valor definido no</w:t>
+      </w:r>
+    </w:p>
+    <w:p>
+      <w:pPr>
+        <w:spacing w:line="360" w:lineRule="auto"/>
+        <w:rPr>
+          <w:sz w:val="24"/>
+          <w:szCs w:val="24"/>
+        </w:rPr>
+      </w:pPr>
+      <w:r>
+        <w:rPr>
+          <w:sz w:val="24"/>
+          <w:szCs w:val="24"/>
+        </w:rPr>
+        <w:t xml:space="preserve">  CSS quando a seção de habilidades entra na tela.</w:t>
+      </w:r>
+    </w:p>
+    <w:p>
+      <w:pPr>
+        <w:spacing w:line="360" w:lineRule="auto"/>
+        <w:rPr>
+          <w:sz w:val="24"/>
+          <w:szCs w:val="24"/>
+        </w:rPr>
+      </w:pPr>
+      <w:r>
+        <w:rPr>
+          <w:sz w:val="24"/>
+          <w:szCs w:val="24"/>
+        </w:rPr>
+        <w:t xml:space="preserve">  O efeito usa </w:t>
+      </w:r>
+      <w:proofErr w:type="spellStart"/>
+      <w:r>
+        <w:rPr>
+          <w:sz w:val="24"/>
+          <w:szCs w:val="24"/>
+        </w:rPr>
+        <w:t>setTimeout</w:t>
+      </w:r>
+      <w:proofErr w:type="spellEnd"/>
+      <w:r>
+        <w:rPr>
+          <w:sz w:val="24"/>
+          <w:szCs w:val="24"/>
+        </w:rPr>
+        <w:t xml:space="preserve"> para sincronizar com a</w:t>
+      </w:r>
+    </w:p>
+    <w:p>
+      <w:pPr>
+        <w:spacing w:line="360" w:lineRule="auto"/>
+        <w:rPr>
+          <w:sz w:val="24"/>
+          <w:szCs w:val="24"/>
+        </w:rPr>
+      </w:pPr>
+      <w:r>
+        <w:rPr>
+          <w:sz w:val="24"/>
+          <w:szCs w:val="24"/>
+        </w:rPr>
+        <w:t xml:space="preserve">  </w:t>
+      </w:r>
+      <w:proofErr w:type="gramStart"/>
+      <w:r>
+        <w:rPr>
+          <w:sz w:val="24"/>
+          <w:szCs w:val="24"/>
+        </w:rPr>
+        <w:t>transição</w:t>
+      </w:r>
+      <w:proofErr w:type="gramEnd"/>
+      <w:r>
+        <w:rPr>
+          <w:sz w:val="24"/>
+          <w:szCs w:val="24"/>
+        </w:rPr>
+        <w:t xml:space="preserve"> CSS.</w:t>
+      </w:r>
+    </w:p>
+    <w:p>
+      <w:pPr>
+        <w:spacing w:line="360" w:lineRule="auto"/>
+        <w:rPr>
+          <w:sz w:val="24"/>
+          <w:szCs w:val="24"/>
+        </w:rPr>
+      </w:pPr>
+    </w:p>
+    <w:p>
+      <w:pPr>
+        <w:spacing w:line="360" w:lineRule="auto"/>
+        <w:rPr>
+          <w:sz w:val="24"/>
+          <w:szCs w:val="24"/>
+        </w:rPr>
+      </w:pPr>
+      <w:r>
+        <w:rPr>
+          <w:sz w:val="24"/>
+          <w:szCs w:val="24"/>
+        </w:rPr>
+        <w:t>8.5 Validação do Formulário</w:t>
+      </w:r>
+    </w:p>
+    <w:p>
+      <w:pPr>
+        <w:spacing w:line="360" w:lineRule="auto"/>
+        <w:rPr>
+          <w:sz w:val="24"/>
+          <w:szCs w:val="24"/>
+        </w:rPr>
+      </w:pPr>
+      <w:r>
+        <w:rPr>
+          <w:sz w:val="24"/>
+          <w:szCs w:val="24"/>
+        </w:rPr>
+        <w:t>────────────────────────────</w:t>
+      </w:r>
+    </w:p>
+    <w:p>
+      <w:pPr>
+        <w:spacing w:line="360" w:lineRule="auto"/>
+        <w:rPr>
+          <w:sz w:val="24"/>
+          <w:szCs w:val="24"/>
+        </w:rPr>
+      </w:pPr>
+      <w:r>
+        <w:rPr>
+          <w:sz w:val="24"/>
+          <w:szCs w:val="24"/>
+        </w:rPr>
+        <w:t xml:space="preserve">  Validações implementadas:</w:t>
+      </w:r>
+    </w:p>
+    <w:p>
+      <w:pPr>
+        <w:spacing w:line="360" w:lineRule="auto"/>
+        <w:rPr>
+          <w:sz w:val="24"/>
+          <w:szCs w:val="24"/>
+        </w:rPr>
+      </w:pPr>
+    </w:p>
+    <w:p>
+      <w:pPr>
+        <w:spacing w:line="360" w:lineRule="auto"/>
+        <w:rPr>
+          <w:sz w:val="24"/>
+          <w:szCs w:val="24"/>
+        </w:rPr>
+      </w:pPr>
+      <w:r>
+        <w:rPr>
+          <w:sz w:val="24"/>
+          <w:szCs w:val="24"/>
+        </w:rPr>
+        <w:t xml:space="preserve">  Campo Nome:</w:t>
+      </w:r>
+    </w:p>
+    <w:p>
+      <w:pPr>
+        <w:spacing w:line="360" w:lineRule="auto"/>
+        <w:rPr>
+          <w:sz w:val="24"/>
+          <w:szCs w:val="24"/>
+        </w:rPr>
+      </w:pPr>
+      <w:r>
+        <w:rPr>
+          <w:sz w:val="24"/>
+          <w:szCs w:val="24"/>
+        </w:rPr>
+        <w:t xml:space="preserve">    - Obrigatório</w:t>
+      </w:r>
+    </w:p>
+    <w:p>
+      <w:pPr>
+        <w:spacing w:line="360" w:lineRule="auto"/>
+        <w:rPr>
+          <w:sz w:val="24"/>
+          <w:szCs w:val="24"/>
+        </w:rPr>
+      </w:pPr>
+      <w:r>
+        <w:rPr>
+          <w:sz w:val="24"/>
+          <w:szCs w:val="24"/>
+        </w:rPr>
+        <w:t xml:space="preserve">    - Mínimo de 3 caracteres</w:t>
+      </w:r>
+    </w:p>
+    <w:p>
+      <w:pPr>
+        <w:spacing w:line="360" w:lineRule="auto"/>
+        <w:rPr>
+          <w:sz w:val="24"/>
+          <w:szCs w:val="24"/>
+        </w:rPr>
+      </w:pPr>
+    </w:p>
+    <w:p>
+      <w:pPr>
+        <w:spacing w:line="360" w:lineRule="auto"/>
+        <w:rPr>
+          <w:sz w:val="24"/>
+          <w:szCs w:val="24"/>
+        </w:rPr>
+      </w:pPr>
+      <w:r>
+        <w:rPr>
+          <w:sz w:val="24"/>
+          <w:szCs w:val="24"/>
+        </w:rPr>
+        <w:t xml:space="preserve">  Campo </w:t>
+      </w:r>
+      <w:proofErr w:type="spellStart"/>
+      <w:r>
+        <w:rPr>
+          <w:sz w:val="24"/>
+          <w:szCs w:val="24"/>
+        </w:rPr>
+        <w:t>Email</w:t>
+      </w:r>
+      <w:proofErr w:type="spellEnd"/>
+      <w:r>
+        <w:rPr>
+          <w:sz w:val="24"/>
+          <w:szCs w:val="24"/>
+        </w:rPr>
+        <w:t>:</w:t>
+      </w:r>
+    </w:p>
+    <w:p>
+      <w:pPr>
+        <w:spacing w:line="360" w:lineRule="auto"/>
+        <w:rPr>
+          <w:sz w:val="24"/>
+          <w:szCs w:val="24"/>
+        </w:rPr>
+      </w:pPr>
+      <w:r>
+        <w:rPr>
+          <w:sz w:val="24"/>
+          <w:szCs w:val="24"/>
+        </w:rPr>
+        <w:t xml:space="preserve">    - Obrigatório</w:t>
+      </w:r>
+    </w:p>
+    <w:p>
+      <w:pPr>
+        <w:spacing w:line="360" w:lineRule="auto"/>
+        <w:rPr>
+          <w:sz w:val="24"/>
+          <w:szCs w:val="24"/>
+        </w:rPr>
+      </w:pPr>
+      <w:r>
+        <w:rPr>
+          <w:sz w:val="24"/>
+          <w:szCs w:val="24"/>
+        </w:rPr>
+        <w:t xml:space="preserve">    - Formato validado com expressão regular:</w:t>
+      </w:r>
+    </w:p>
+    <w:p>
+      <w:pPr>
+        <w:spacing w:line="360" w:lineRule="auto"/>
+        <w:rPr>
+          <w:sz w:val="24"/>
+          <w:szCs w:val="24"/>
+        </w:rPr>
+      </w:pPr>
+      <w:r>
+        <w:rPr>
+          <w:sz w:val="24"/>
+          <w:szCs w:val="24"/>
+        </w:rPr>
+        <w:t xml:space="preserve">      /^[^\s@]+@[^\s@]+</w:t>
+      </w:r>
+      <w:proofErr w:type="gramStart"/>
+      <w:r>
+        <w:rPr>
+          <w:sz w:val="24"/>
+          <w:szCs w:val="24"/>
+        </w:rPr>
+        <w:t>\.[</w:t>
+      </w:r>
+      <w:proofErr w:type="gramEnd"/>
+      <w:r>
+        <w:rPr>
+          <w:sz w:val="24"/>
+          <w:szCs w:val="24"/>
+        </w:rPr>
+        <w:t>^\s@]+$/</w:t>
+      </w:r>
+    </w:p>
+    <w:p>
+      <w:pPr>
+        <w:spacing w:line="360" w:lineRule="auto"/>
+        <w:rPr>
+          <w:sz w:val="24"/>
+          <w:szCs w:val="24"/>
+        </w:rPr>
+      </w:pPr>
+    </w:p>
+    <w:p>
+      <w:pPr>
+        <w:spacing w:line="360" w:lineRule="auto"/>
+        <w:rPr>
+          <w:sz w:val="24"/>
+          <w:szCs w:val="24"/>
+        </w:rPr>
+      </w:pPr>
+      <w:r>
+        <w:rPr>
+          <w:sz w:val="24"/>
+          <w:szCs w:val="24"/>
+        </w:rPr>
+        <w:t xml:space="preserve">  Campo Mensagem:</w:t>
+      </w:r>
+    </w:p>
+    <w:p>
+      <w:pPr>
+        <w:spacing w:line="360" w:lineRule="auto"/>
+        <w:rPr>
+          <w:sz w:val="24"/>
+          <w:szCs w:val="24"/>
+        </w:rPr>
+      </w:pPr>
+      <w:r>
+        <w:rPr>
+          <w:sz w:val="24"/>
+          <w:szCs w:val="24"/>
+        </w:rPr>
+        <w:t xml:space="preserve">    - Obrigatório</w:t>
+      </w:r>
+    </w:p>
+    <w:p>
+      <w:pPr>
+        <w:spacing w:line="360" w:lineRule="auto"/>
+        <w:rPr>
+          <w:sz w:val="24"/>
+          <w:szCs w:val="24"/>
+        </w:rPr>
+      </w:pPr>
+      <w:r>
+        <w:rPr>
+          <w:sz w:val="24"/>
+          <w:szCs w:val="24"/>
+        </w:rPr>
+        <w:t xml:space="preserve">    - Mínimo de 10 caracteres</w:t>
+      </w:r>
+    </w:p>
+    <w:p>
+      <w:pPr>
+        <w:spacing w:line="360" w:lineRule="auto"/>
+        <w:rPr>
+          <w:sz w:val="24"/>
+          <w:szCs w:val="24"/>
+        </w:rPr>
+      </w:pPr>
+    </w:p>
+    <w:p>
+      <w:pPr>
+        <w:spacing w:line="360" w:lineRule="auto"/>
+        <w:rPr>
+          <w:sz w:val="24"/>
+          <w:szCs w:val="24"/>
+        </w:rPr>
+      </w:pPr>
+      <w:r>
+        <w:rPr>
+          <w:sz w:val="24"/>
+          <w:szCs w:val="24"/>
+        </w:rPr>
+        <w:t xml:space="preserve">  Comportamentos:</w:t>
+      </w:r>
+    </w:p>
+    <w:p>
+      <w:pPr>
+        <w:spacing w:line="360" w:lineRule="auto"/>
+        <w:rPr>
+          <w:sz w:val="24"/>
+          <w:szCs w:val="24"/>
+        </w:rPr>
+      </w:pPr>
+      <w:r>
+        <w:rPr>
+          <w:sz w:val="24"/>
+          <w:szCs w:val="24"/>
+        </w:rPr>
+        <w:t xml:space="preserve">    - Erros exibidos abaixo de cada campo</w:t>
+      </w:r>
+    </w:p>
+    <w:p>
+      <w:pPr>
+        <w:spacing w:line="360" w:lineRule="auto"/>
+        <w:rPr>
+          <w:sz w:val="24"/>
+          <w:szCs w:val="24"/>
+        </w:rPr>
+      </w:pPr>
+      <w:r>
+        <w:rPr>
+          <w:sz w:val="24"/>
+          <w:szCs w:val="24"/>
+        </w:rPr>
+        <w:t xml:space="preserve">    - Validação em tempo real ao sair do campo (</w:t>
+      </w:r>
+      <w:proofErr w:type="spellStart"/>
+      <w:r>
+        <w:rPr>
+          <w:sz w:val="24"/>
+          <w:szCs w:val="24"/>
+        </w:rPr>
+        <w:t>blur</w:t>
+      </w:r>
+      <w:proofErr w:type="spellEnd"/>
+      <w:r>
+        <w:rPr>
+          <w:sz w:val="24"/>
+          <w:szCs w:val="24"/>
+        </w:rPr>
+        <w:t>)</w:t>
+      </w:r>
+    </w:p>
+    <w:p>
+      <w:pPr>
+        <w:spacing w:line="360" w:lineRule="auto"/>
+        <w:rPr>
+          <w:sz w:val="24"/>
+          <w:szCs w:val="24"/>
+        </w:rPr>
+      </w:pPr>
+      <w:r>
+        <w:rPr>
+          <w:sz w:val="24"/>
+          <w:szCs w:val="24"/>
+        </w:rPr>
+        <w:t xml:space="preserve">    - Mensagem de sucesso exibida por 4 segundos</w:t>
+      </w:r>
+    </w:p>
+    <w:p>
+      <w:pPr>
+        <w:spacing w:line="360" w:lineRule="auto"/>
+        <w:rPr>
+          <w:sz w:val="24"/>
+          <w:szCs w:val="24"/>
+        </w:rPr>
+      </w:pPr>
+      <w:r>
+        <w:rPr>
+          <w:sz w:val="24"/>
+          <w:szCs w:val="24"/>
+        </w:rPr>
+        <w:t xml:space="preserve">    - Formulário limpo após envio bem-sucedido</w:t>
+      </w:r>
+    </w:p>
+    <w:p>
+      <w:pPr>
+        <w:spacing w:line="360" w:lineRule="auto"/>
+        <w:rPr>
+          <w:sz w:val="24"/>
+          <w:szCs w:val="24"/>
+        </w:rPr>
+      </w:pPr>
+    </w:p>
+    <w:p>
+      <w:pPr>
+        <w:spacing w:line="360" w:lineRule="auto"/>
+        <w:rPr>
+          <w:sz w:val="24"/>
+          <w:szCs w:val="24"/>
+        </w:rPr>
+      </w:pPr>
+      <w:r>
+        <w:rPr>
+          <w:sz w:val="24"/>
+          <w:szCs w:val="24"/>
+        </w:rPr>
+        <w:t>8.6 Link Ativo no Menu</w:t>
+      </w:r>
+    </w:p>
+    <w:p>
+      <w:pPr>
+        <w:spacing w:line="360" w:lineRule="auto"/>
+        <w:rPr>
+          <w:sz w:val="24"/>
+          <w:szCs w:val="24"/>
+        </w:rPr>
+      </w:pPr>
+      <w:r>
+        <w:rPr>
+          <w:sz w:val="24"/>
+          <w:szCs w:val="24"/>
+        </w:rPr>
+        <w:t>───────────────────────</w:t>
+      </w:r>
+    </w:p>
+    <w:p>
+      <w:pPr>
+        <w:spacing w:line="360" w:lineRule="auto"/>
+        <w:rPr>
+          <w:sz w:val="24"/>
+          <w:szCs w:val="24"/>
+        </w:rPr>
+      </w:pPr>
+      <w:r>
+        <w:rPr>
+          <w:sz w:val="24"/>
+          <w:szCs w:val="24"/>
+        </w:rPr>
+        <w:t xml:space="preserve">  Detecta automaticamente a página atual via</w:t>
+      </w:r>
+    </w:p>
+    <w:p>
+      <w:pPr>
+        <w:spacing w:line="360" w:lineRule="auto"/>
+        <w:rPr>
+          <w:sz w:val="24"/>
+          <w:szCs w:val="24"/>
+        </w:rPr>
+      </w:pPr>
+      <w:r>
+        <w:rPr>
+          <w:sz w:val="24"/>
+          <w:szCs w:val="24"/>
+        </w:rPr>
+        <w:t xml:space="preserve">  </w:t>
+      </w:r>
+      <w:proofErr w:type="spellStart"/>
+      <w:proofErr w:type="gramStart"/>
+      <w:r>
+        <w:rPr>
+          <w:sz w:val="24"/>
+          <w:szCs w:val="24"/>
         </w:rPr>
         <w:t>window.location</w:t>
       </w:r>
@@ -6976,15 +6831,7 @@
           <w:sz w:val="24"/>
           <w:szCs w:val="24"/>
         </w:rPr>
-        <w:t>resolvi</w:t>
-      </w:r>
-      <w:r>
-        <w:rPr>
-          <w:color w:val="434343"/>
-          <w:sz w:val="24"/>
-          <w:szCs w:val="24"/>
-        </w:rPr>
-        <w:t>dos</w:t>
+        <w:t>resolvidos</w:t>
       </w:r>
       <w:proofErr w:type="gramEnd"/>
       <w:r>
@@ -7083,15 +6930,7 @@
           <w:sz w:val="24"/>
           <w:szCs w:val="24"/>
         </w:rPr>
-        <w:t xml:space="preserve"> e b</w:t>
-      </w:r>
-      <w:r>
-        <w:rPr>
-          <w:color w:val="434343"/>
-          <w:sz w:val="24"/>
-          <w:szCs w:val="24"/>
-        </w:rPr>
-        <w:t>ackground-color sólido no menu.</w:t>
+        <w:t xml:space="preserve"> e background-color sólido no menu.</w:t>
       </w:r>
     </w:p>
     <w:p>
@@ -7358,15 +7197,7 @@
           <w:sz w:val="24"/>
           <w:szCs w:val="24"/>
         </w:rPr>
-        <w:t xml:space="preserve"> ind</w:t>
-      </w:r>
-      <w:r>
-        <w:rPr>
-          <w:color w:val="434343"/>
-          <w:sz w:val="24"/>
-          <w:szCs w:val="24"/>
-        </w:rPr>
-        <w:t>ependente do servidor ou pasta.</w:t>
+        <w:t xml:space="preserve"> independente do servidor ou pasta.</w:t>
       </w:r>
     </w:p>
     <w:p>
@@ -7519,15 +7350,7 @@
           <w:sz w:val="24"/>
           <w:szCs w:val="24"/>
         </w:rPr>
-        <w:t>JavaS</w:t>
-      </w:r>
-      <w:r>
-        <w:rPr>
-          <w:color w:val="434343"/>
-          <w:sz w:val="24"/>
-          <w:szCs w:val="24"/>
-        </w:rPr>
-        <w:t>cript</w:t>
+        <w:t>JavaScript</w:t>
       </w:r>
       <w:proofErr w:type="spellEnd"/>
       <w:r>
@@ -7808,15 +7631,7 @@
           <w:sz w:val="24"/>
           <w:szCs w:val="24"/>
         </w:rPr>
-        <w:t xml:space="preserve"> os requisitos e</w:t>
-      </w:r>
-      <w:r>
-        <w:rPr>
-          <w:color w:val="434343"/>
-          <w:sz w:val="24"/>
-          <w:szCs w:val="24"/>
-        </w:rPr>
-        <w:t>stabelecidos pela atividade.</w:t>
+        <w:t xml:space="preserve"> os requisitos estabelecidos pela atividade.</w:t>
       </w:r>
     </w:p>
     <w:p>
@@ -7853,15 +7668,7 @@
           <w:sz w:val="24"/>
           <w:szCs w:val="24"/>
         </w:rPr>
-        <w:t>apli</w:t>
-      </w:r>
-      <w:r>
-        <w:rPr>
-          <w:color w:val="434343"/>
-          <w:sz w:val="24"/>
-          <w:szCs w:val="24"/>
-        </w:rPr>
-        <w:t>car</w:t>
+        <w:t>aplicar</w:t>
       </w:r>
       <w:proofErr w:type="gramEnd"/>
       <w:r>
@@ -8073,15 +7880,7 @@
           <w:sz w:val="24"/>
           <w:szCs w:val="24"/>
         </w:rPr>
-        <w:t xml:space="preserve"> Organização e documentação de có</w:t>
-      </w:r>
-      <w:r>
-        <w:rPr>
-          <w:color w:val="434343"/>
-          <w:sz w:val="24"/>
-          <w:szCs w:val="24"/>
-        </w:rPr>
-        <w:t>digo</w:t>
+        <w:t xml:space="preserve"> Organização e documentação de código</w:t>
       </w:r>
     </w:p>
     <w:p>
@@ -8156,15 +7955,7 @@
           <w:sz w:val="24"/>
           <w:szCs w:val="24"/>
         </w:rPr>
-        <w:t xml:space="preserve"> por</w:t>
-      </w:r>
-      <w:r>
-        <w:rPr>
-          <w:color w:val="434343"/>
-          <w:sz w:val="24"/>
-          <w:szCs w:val="24"/>
-        </w:rPr>
-        <w:t>tfólio real e publicado na web.</w:t>
+        <w:t xml:space="preserve"> portfólio real e publicado na web.</w:t>
       </w:r>
     </w:p>
     <w:p>
@@ -8372,15 +8163,7 @@
           <w:sz w:val="24"/>
           <w:szCs w:val="24"/>
         </w:rPr>
-        <w:t>Disponível em: https://developer.mozilla.org/pt-BR/docs/Web/H</w:t>
-      </w:r>
-      <w:r>
-        <w:rPr>
-          <w:color w:val="434343"/>
-          <w:sz w:val="24"/>
-          <w:szCs w:val="24"/>
-        </w:rPr>
-        <w:t>TML</w:t>
+        <w:t>Disponível em: https://developer.mozilla.org/pt-BR/docs/Web/HTML</w:t>
       </w:r>
     </w:p>
     <w:p>
@@ -8390,69 +8173,17 @@
           <w:color w:val="434343"/>
           <w:sz w:val="24"/>
           <w:szCs w:val="24"/>
-        </w:rPr>
-      </w:pPr>
-      <w:r>
-        <w:rPr>
-          <w:color w:val="434343"/>
-          <w:sz w:val="24"/>
-          <w:szCs w:val="24"/>
-        </w:rPr>
-        <w:t xml:space="preserve">MDN Web Docs. CSS: </w:t>
-      </w:r>
-      <w:proofErr w:type="spellStart"/>
-      <w:r>
-        <w:rPr>
-          <w:color w:val="434343"/>
-          <w:sz w:val="24"/>
-          <w:szCs w:val="24"/>
-        </w:rPr>
-        <w:t>Cascading</w:t>
-      </w:r>
-      <w:proofErr w:type="spellEnd"/>
-      <w:r>
-        <w:rPr>
-          <w:color w:val="434343"/>
-          <w:sz w:val="24"/>
-          <w:szCs w:val="24"/>
-        </w:rPr>
-        <w:t xml:space="preserve"> </w:t>
-      </w:r>
-      <w:proofErr w:type="spellStart"/>
-      <w:r>
-        <w:rPr>
-          <w:color w:val="434343"/>
-          <w:sz w:val="24"/>
-          <w:szCs w:val="24"/>
-        </w:rPr>
-        <w:t>Style</w:t>
-      </w:r>
-      <w:proofErr w:type="spellEnd"/>
-      <w:r>
-        <w:rPr>
-          <w:color w:val="434343"/>
-          <w:sz w:val="24"/>
-          <w:szCs w:val="24"/>
-        </w:rPr>
-        <w:t xml:space="preserve"> </w:t>
-      </w:r>
-      <w:proofErr w:type="spellStart"/>
-      <w:r>
-        <w:rPr>
-          <w:color w:val="434343"/>
-          <w:sz w:val="24"/>
-          <w:szCs w:val="24"/>
-        </w:rPr>
-        <w:t>Sheets</w:t>
-      </w:r>
-      <w:proofErr w:type="spellEnd"/>
-      <w:r>
-        <w:rPr>
-          <w:color w:val="434343"/>
-          <w:sz w:val="24"/>
-          <w:szCs w:val="24"/>
-        </w:rPr>
-        <w:t>.</w:t>
+          <w:lang w:val="en-US"/>
+        </w:rPr>
+      </w:pPr>
+      <w:r>
+        <w:rPr>
+          <w:color w:val="434343"/>
+          <w:sz w:val="24"/>
+          <w:szCs w:val="24"/>
+          <w:lang w:val="en-US"/>
+        </w:rPr>
+        <w:t>MDN Web Docs. CSS: Cascading Style Sheets.</w:t>
       </w:r>
     </w:p>
     <w:p>
@@ -8470,15 +8201,7 @@
           <w:sz w:val="24"/>
           <w:szCs w:val="24"/>
         </w:rPr>
-        <w:t>Disponível em: https://developer</w:t>
-      </w:r>
-      <w:r>
-        <w:rPr>
-          <w:color w:val="434343"/>
-          <w:sz w:val="24"/>
-          <w:szCs w:val="24"/>
-        </w:rPr>
-        <w:t>.mozilla.org/pt-BR/docs/Web/CSS</w:t>
+        <w:t>Disponível em: https://developer.mozilla.org/pt-BR/docs/Web/CSS</w:t>
       </w:r>
     </w:p>
     <w:p>
@@ -8533,15 +8256,7 @@
           <w:sz w:val="24"/>
           <w:szCs w:val="24"/>
         </w:rPr>
-        <w:t>Disponível em: https://developer.mozill</w:t>
-      </w:r>
-      <w:r>
-        <w:rPr>
-          <w:color w:val="434343"/>
-          <w:sz w:val="24"/>
-          <w:szCs w:val="24"/>
-        </w:rPr>
-        <w:t>a.org/pt-BR/docs/Web/JavaScript</w:t>
+        <w:t>Disponível em: https://developer.mozilla.org/pt-BR/docs/Web/JavaScript</w:t>
       </w:r>
     </w:p>
     <w:p>
@@ -8551,24 +8266,38 @@
           <w:color w:val="434343"/>
           <w:sz w:val="24"/>
           <w:szCs w:val="24"/>
-        </w:rPr>
-      </w:pPr>
-      <w:r>
-        <w:rPr>
-          <w:color w:val="434343"/>
-          <w:sz w:val="24"/>
-          <w:szCs w:val="24"/>
-        </w:rPr>
-        <w:t xml:space="preserve">W3Schools. HTML5 </w:t>
-      </w:r>
+          <w:lang w:val="en-US"/>
+        </w:rPr>
+      </w:pPr>
+      <w:r>
+        <w:rPr>
+          <w:color w:val="434343"/>
+          <w:sz w:val="24"/>
+          <w:szCs w:val="24"/>
+          <w:lang w:val="en-US"/>
+        </w:rPr>
+        <w:t>W3Schools. HTML5 Semantic Elements.</w:t>
+      </w:r>
+    </w:p>
+    <w:p>
+      <w:pPr>
+        <w:spacing w:before="720" w:after="720" w:line="360" w:lineRule="auto"/>
+        <w:rPr>
+          <w:color w:val="434343"/>
+          <w:sz w:val="24"/>
+          <w:szCs w:val="24"/>
+          <w:lang w:val="en-US"/>
+        </w:rPr>
+      </w:pPr>
       <w:proofErr w:type="spellStart"/>
       <w:r>
         <w:rPr>
           <w:color w:val="434343"/>
           <w:sz w:val="24"/>
           <w:szCs w:val="24"/>
-        </w:rPr>
-        <w:t>Semantic</w:t>
+          <w:lang w:val="en-US"/>
+        </w:rPr>
+        <w:t>Disponível</w:t>
       </w:r>
       <w:proofErr w:type="spellEnd"/>
       <w:r>
@@ -8576,6 +8305,7 @@
           <w:color w:val="434343"/>
           <w:sz w:val="24"/>
           <w:szCs w:val="24"/>
+          <w:lang w:val="en-US"/>
         </w:rPr>
         <w:t xml:space="preserve"> </w:t>
       </w:r>
@@ -8585,8 +8315,9 @@
           <w:color w:val="434343"/>
           <w:sz w:val="24"/>
           <w:szCs w:val="24"/>
-        </w:rPr>
-        <w:t>Elements</w:t>
+          <w:lang w:val="en-US"/>
+        </w:rPr>
+        <w:t>em</w:t>
       </w:r>
       <w:proofErr w:type="spellEnd"/>
       <w:r>
@@ -8594,8 +8325,9 @@
           <w:color w:val="434343"/>
           <w:sz w:val="24"/>
           <w:szCs w:val="24"/>
-        </w:rPr>
-        <w:t>.</w:t>
+          <w:lang w:val="en-US"/>
+        </w:rPr>
+        <w:t>: https://www.w3schools.com/html/html5_semantic_elements.asp</w:t>
       </w:r>
     </w:p>
     <w:p>
@@ -8605,23 +8337,17 @@
           <w:color w:val="434343"/>
           <w:sz w:val="24"/>
           <w:szCs w:val="24"/>
-        </w:rPr>
-      </w:pPr>
-      <w:r>
-        <w:rPr>
-          <w:color w:val="434343"/>
-          <w:sz w:val="24"/>
-          <w:szCs w:val="24"/>
-        </w:rPr>
-        <w:t>Disponível em: https://www.w3schools.com/h</w:t>
-      </w:r>
-      <w:r>
-        <w:rPr>
-          <w:color w:val="434343"/>
-          <w:sz w:val="24"/>
-          <w:szCs w:val="24"/>
-        </w:rPr>
-        <w:t>tml/html5_semantic_elements.asp</w:t>
+          <w:lang w:val="en-US"/>
+        </w:rPr>
+      </w:pPr>
+      <w:r>
+        <w:rPr>
+          <w:color w:val="434343"/>
+          <w:sz w:val="24"/>
+          <w:szCs w:val="24"/>
+          <w:lang w:val="en-US"/>
+        </w:rPr>
+        <w:t>W3C. Web Content Accessibility Guidelines (WCAG).</w:t>
       </w:r>
     </w:p>
     <w:p>
@@ -8639,61 +8365,7 @@
           <w:sz w:val="24"/>
           <w:szCs w:val="24"/>
         </w:rPr>
-        <w:t xml:space="preserve">W3C. Web </w:t>
-      </w:r>
-      <w:proofErr w:type="spellStart"/>
-      <w:r>
-        <w:rPr>
-          <w:color w:val="434343"/>
-          <w:sz w:val="24"/>
-          <w:szCs w:val="24"/>
-        </w:rPr>
-        <w:t>Content</w:t>
-      </w:r>
-      <w:proofErr w:type="spellEnd"/>
-      <w:r>
-        <w:rPr>
-          <w:color w:val="434343"/>
-          <w:sz w:val="24"/>
-          <w:szCs w:val="24"/>
-        </w:rPr>
-        <w:t xml:space="preserve"> </w:t>
-      </w:r>
-      <w:proofErr w:type="spellStart"/>
-      <w:r>
-        <w:rPr>
-          <w:color w:val="434343"/>
-          <w:sz w:val="24"/>
-          <w:szCs w:val="24"/>
-        </w:rPr>
-        <w:t>Accessibility</w:t>
-      </w:r>
-      <w:proofErr w:type="spellEnd"/>
-      <w:r>
-        <w:rPr>
-          <w:color w:val="434343"/>
-          <w:sz w:val="24"/>
-          <w:szCs w:val="24"/>
-        </w:rPr>
-        <w:t xml:space="preserve"> </w:t>
-      </w:r>
-      <w:proofErr w:type="spellStart"/>
-      <w:r>
-        <w:rPr>
-          <w:color w:val="434343"/>
-          <w:sz w:val="24"/>
-          <w:szCs w:val="24"/>
-        </w:rPr>
-        <w:t>Guidelines</w:t>
-      </w:r>
-      <w:proofErr w:type="spellEnd"/>
-      <w:r>
-        <w:rPr>
-          <w:color w:val="434343"/>
-          <w:sz w:val="24"/>
-          <w:szCs w:val="24"/>
-        </w:rPr>
-        <w:t xml:space="preserve"> (WCAG).</w:t>
+        <w:t>Disponível em: https://www.w3.org/WAI/standards-guidelines/wcag/</w:t>
       </w:r>
     </w:p>
     <w:p>
@@ -8703,161 +8375,39 @@
           <w:color w:val="434343"/>
           <w:sz w:val="24"/>
           <w:szCs w:val="24"/>
-        </w:rPr>
-      </w:pPr>
-      <w:r>
-        <w:rPr>
-          <w:color w:val="434343"/>
-          <w:sz w:val="24"/>
-          <w:szCs w:val="24"/>
-        </w:rPr>
-        <w:t>Disponível em: https://www.w3.org</w:t>
-      </w:r>
-      <w:r>
-        <w:rPr>
-          <w:color w:val="434343"/>
-          <w:sz w:val="24"/>
-          <w:szCs w:val="24"/>
-        </w:rPr>
-        <w:t>/WAI/standards-guidelines/wcag/</w:t>
+          <w:lang w:val="en-US"/>
+        </w:rPr>
+      </w:pPr>
+      <w:r>
+        <w:rPr>
+          <w:color w:val="434343"/>
+          <w:sz w:val="24"/>
+          <w:szCs w:val="24"/>
+          <w:lang w:val="en-US"/>
+        </w:rPr>
+        <w:t>Google Developers. Search Engine Optimization Starter Guide.</w:t>
       </w:r>
     </w:p>
     <w:p>
       <w:pPr>
         <w:spacing w:before="720" w:after="720" w:line="360" w:lineRule="auto"/>
         <w:rPr>
-          <w:color w:val="434343"/>
-          <w:sz w:val="24"/>
-          <w:szCs w:val="24"/>
-        </w:rPr>
-      </w:pPr>
-      <w:r>
-        <w:rPr>
-          <w:color w:val="434343"/>
-          <w:sz w:val="24"/>
-          <w:szCs w:val="24"/>
-        </w:rPr>
-        <w:t xml:space="preserve">Google </w:t>
-      </w:r>
-      <w:proofErr w:type="spellStart"/>
-      <w:r>
-        <w:rPr>
-          <w:color w:val="434343"/>
-          <w:sz w:val="24"/>
-          <w:szCs w:val="24"/>
-        </w:rPr>
-        <w:t>Developers</w:t>
-      </w:r>
-      <w:proofErr w:type="spellEnd"/>
-      <w:r>
-        <w:rPr>
-          <w:color w:val="434343"/>
-          <w:sz w:val="24"/>
-          <w:szCs w:val="24"/>
-        </w:rPr>
-        <w:t xml:space="preserve">. </w:t>
-      </w:r>
-      <w:proofErr w:type="spellStart"/>
-      <w:r>
-        <w:rPr>
-          <w:color w:val="434343"/>
-          <w:sz w:val="24"/>
-          <w:szCs w:val="24"/>
-        </w:rPr>
-        <w:t>Search</w:t>
-      </w:r>
-      <w:proofErr w:type="spellEnd"/>
-      <w:r>
-        <w:rPr>
-          <w:color w:val="434343"/>
-          <w:sz w:val="24"/>
-          <w:szCs w:val="24"/>
-        </w:rPr>
-        <w:t xml:space="preserve"> </w:t>
-      </w:r>
-      <w:proofErr w:type="spellStart"/>
-      <w:r>
-        <w:rPr>
-          <w:color w:val="434343"/>
-          <w:sz w:val="24"/>
-          <w:szCs w:val="24"/>
-        </w:rPr>
-        <w:t>Engine</w:t>
-      </w:r>
-      <w:proofErr w:type="spellEnd"/>
-      <w:r>
-        <w:rPr>
-          <w:color w:val="434343"/>
-          <w:sz w:val="24"/>
-          <w:szCs w:val="24"/>
-        </w:rPr>
-        <w:t xml:space="preserve"> </w:t>
-      </w:r>
-      <w:proofErr w:type="spellStart"/>
-      <w:r>
-        <w:rPr>
-          <w:color w:val="434343"/>
-          <w:sz w:val="24"/>
-          <w:szCs w:val="24"/>
-        </w:rPr>
-        <w:t>Optimization</w:t>
-      </w:r>
-      <w:proofErr w:type="spellEnd"/>
-      <w:r>
-        <w:rPr>
-          <w:color w:val="434343"/>
-          <w:sz w:val="24"/>
-          <w:szCs w:val="24"/>
-        </w:rPr>
-        <w:t xml:space="preserve"> Starter </w:t>
-      </w:r>
-      <w:proofErr w:type="spellStart"/>
-      <w:r>
-        <w:rPr>
-          <w:color w:val="434343"/>
-          <w:sz w:val="24"/>
-          <w:szCs w:val="24"/>
-        </w:rPr>
-        <w:t>Guide</w:t>
-      </w:r>
-      <w:proofErr w:type="spellEnd"/>
-      <w:r>
-        <w:rPr>
-          <w:color w:val="434343"/>
-          <w:sz w:val="24"/>
-          <w:szCs w:val="24"/>
-        </w:rPr>
-        <w:t>.</w:t>
-      </w:r>
-    </w:p>
-    <w:p>
-      <w:pPr>
-        <w:spacing w:before="720" w:after="720" w:line="360" w:lineRule="auto"/>
-        <w:rPr>
-          <w:sz w:val="24"/>
-          <w:szCs w:val="24"/>
-        </w:rPr>
-      </w:pPr>
-      <w:r>
-        <w:rPr>
-          <w:color w:val="434343"/>
-          <w:sz w:val="24"/>
-          <w:szCs w:val="24"/>
-        </w:rPr>
-        <w:t>Disponível em: https://developers.google.com/search/docs</w:t>
-      </w:r>
-      <w:r>
-        <w:rPr>
-          <w:color w:val="434343"/>
-          <w:sz w:val="24"/>
-          <w:szCs w:val="24"/>
-        </w:rPr>
-        <w:t xml:space="preserve"> </w:t>
+          <w:sz w:val="24"/>
+          <w:szCs w:val="24"/>
+        </w:rPr>
+      </w:pPr>
+      <w:r>
+        <w:rPr>
+          <w:color w:val="434343"/>
+          <w:sz w:val="24"/>
+          <w:szCs w:val="24"/>
+        </w:rPr>
+        <w:t xml:space="preserve">Disponível em: https://developers.google.com/search/docs </w:t>
       </w:r>
     </w:p>
     <w:p/>
     <w:sectPr>
-      <w:headerReference w:type="default" r:id="rId8"/>
+      <w:headerReference w:type="default" r:id="rId9"/>
       <w:pgSz w:w="11909" w:h="16834" w:code="9"/>
       <w:pgMar w:top="1417" w:right="1701" w:bottom="1417" w:left="1701" w:header="720" w:footer="720" w:gutter="0"/>
       <w:pgNumType w:start="1"/>
@@ -9828,6 +9378,7 @@
   <w:style w:type="character" w:default="1" w:styleId="Fontepargpadro">
     <w:name w:val="Default Paragraph Font"/>
     <w:uiPriority w:val="1"/>
+    <w:semiHidden/>
     <w:unhideWhenUsed/>
   </w:style>
   <w:style w:type="table" w:default="1" w:styleId="Tabelanormal">
@@ -10040,6 +9591,29 @@
     <w:pPr>
       <w:spacing w:line="240" w:lineRule="auto"/>
     </w:pPr>
+  </w:style>
+  <w:style w:type="character" w:styleId="Hyperlink">
+    <w:name w:val="Hyperlink"/>
+    <w:basedOn w:val="Fontepargpadro"/>
+    <w:uiPriority w:val="99"/>
+    <w:unhideWhenUsed/>
+    <w:rsid w:val="007A3143"/>
+    <w:rPr>
+      <w:color w:val="0000FF" w:themeColor="hyperlink"/>
+      <w:u w:val="single"/>
+    </w:rPr>
+  </w:style>
+  <w:style w:type="character" w:styleId="HiperlinkVisitado">
+    <w:name w:val="FollowedHyperlink"/>
+    <w:basedOn w:val="Fontepargpadro"/>
+    <w:uiPriority w:val="99"/>
+    <w:semiHidden/>
+    <w:unhideWhenUsed/>
+    <w:rsid w:val="007A3143"/>
+    <w:rPr>
+      <w:color w:val="800080" w:themeColor="followedHyperlink"/>
+      <w:u w:val="single"/>
+    </w:rPr>
   </w:style>
 </w:styles>
 </file>
@@ -10369,7 +9943,7 @@
 </file>
 
 <file path=customXml/itemProps1.xml><?xml version="1.0" encoding="utf-8"?>
-<ds:datastoreItem xmlns:ds="http://schemas.openxmlformats.org/officeDocument/2006/customXml" ds:itemID="{19C31098-ACD0-4171-953C-0EDEF3F87D18}">
+<ds:datastoreItem xmlns:ds="http://schemas.openxmlformats.org/officeDocument/2006/customXml" ds:itemID="{43C0A9BB-B780-47FE-9226-C55F14C8071D}">
   <ds:schemaRefs>
     <ds:schemaRef ds:uri="http://schemas.openxmlformats.org/officeDocument/2006/bibliography"/>
   </ds:schemaRefs>

</xml_diff>